<commit_message>
Problem bank: punchy titles and more specific briefs
</commit_message>
<xml_diff>
--- a/docs/02-theme-tracks-judging-agenda.docx
+++ b/docs/02-theme-tracks-judging-agenda.docx
@@ -833,7 +833,17 @@
         </w:numPr>
       </w:pPr>
       <w:r>
-        <w:t xml:space="preserve">Help a parent in a ger district decide each morning whether a child walks to school, rides, or stays home.</w:t>
+        <w:rPr>
+          <w:b/>
+          <w:bCs/>
+        </w:rPr>
+        <w:t xml:space="preserve">Walk, bus or stay home?</w:t>
+      </w:r>
+      <w:r>
+        <w:t xml:space="preserve"> </w:t>
+      </w:r>
+      <w:r>
+        <w:t xml:space="preserve">— At 7:30 a.m. a parent in a ger district checks one screen and knows whether their eight-year-old walks to school today, rides, or stays in.</w:t>
       </w:r>
     </w:p>
     <w:p>
@@ -845,7 +855,17 @@
         </w:numPr>
       </w:pPr>
       <w:r>
-        <w:t xml:space="preserve">Help a school principal decide when to keep breaks indoors and prove the decision to parents.</w:t>
+        <w:rPr>
+          <w:b/>
+          <w:bCs/>
+        </w:rPr>
+        <w:t xml:space="preserve">Recess indoors, receipts included</w:t>
+      </w:r>
+      <w:r>
+        <w:t xml:space="preserve"> </w:t>
+      </w:r>
+      <w:r>
+        <w:t xml:space="preserve">— A school principal decides when breaks move indoors and can show parents the air numbers behind the call.</w:t>
       </w:r>
     </w:p>
     <w:p>
@@ -857,7 +877,17 @@
         </w:numPr>
       </w:pPr>
       <w:r>
-        <w:t xml:space="preserve">Help a household choose and afford a mask or purifier that matches its stove, room and budget.</w:t>
+        <w:rPr>
+          <w:b/>
+          <w:bCs/>
+        </w:rPr>
+        <w:t xml:space="preserve">Which purifier is worth it?</w:t>
+      </w:r>
+      <w:r>
+        <w:t xml:space="preserve"> </w:t>
+      </w:r>
+      <w:r>
+        <w:t xml:space="preserve">— A family with one stove, one room and a tight budget finds the mask or purifier that actually helps, and what it costs per winter.</w:t>
       </w:r>
     </w:p>
     <w:p>
@@ -869,7 +899,17 @@
         </w:numPr>
       </w:pPr>
       <w:r>
-        <w:t xml:space="preserve">Help a clinic predict tomorrow's pediatric respiratory visits from today's air.</w:t>
+        <w:rPr>
+          <w:b/>
+          <w:bCs/>
+        </w:rPr>
+        <w:t xml:space="preserve">Tomorrow's coughs, today</w:t>
+      </w:r>
+      <w:r>
+        <w:t xml:space="preserve"> </w:t>
+      </w:r>
+      <w:r>
+        <w:t xml:space="preserve">— A clinic sees how many children will come in with breathing problems tomorrow, from today's air.</w:t>
       </w:r>
     </w:p>
     <w:p>
@@ -887,25 +927,89 @@
         <w:t xml:space="preserve"> </w:t>
       </w:r>
       <w:r>
-        <w:t xml:space="preserve">5. Warn a briquette-heated household before the coldest night of the week, in time to ventilate.</w:t>
-      </w:r>
-      <w:r>
-        <w:t xml:space="preserve"> </w:t>
-      </w:r>
-      <w:r>
-        <w:t xml:space="preserve">6. Help a family detect carbon monoxide without a 100,000-tugrik device.</w:t>
-      </w:r>
-      <w:r>
-        <w:t xml:space="preserve"> </w:t>
-      </w:r>
-      <w:r>
-        <w:t xml:space="preserve">7. Help a person with early symptoms recognize poisoning and reach 103 in under a minute.</w:t>
-      </w:r>
-      <w:r>
-        <w:t xml:space="preserve"> </w:t>
-      </w:r>
-      <w:r>
-        <w:t xml:space="preserve">8. Help emergency services position crews on the nights poisoning peaks.</w:t>
+        <w:t xml:space="preserve">5.</w:t>
+      </w:r>
+      <w:r>
+        <w:t xml:space="preserve"> </w:t>
+      </w:r>
+      <w:r>
+        <w:rPr>
+          <w:b/>
+          <w:bCs/>
+        </w:rPr>
+        <w:t xml:space="preserve">The coldest-night alarm</w:t>
+      </w:r>
+      <w:r>
+        <w:t xml:space="preserve"> </w:t>
+      </w:r>
+      <w:r>
+        <w:t xml:space="preserve">— Two days before the coldest night of the week, a briquette-heated household gets a message: ventilate, check the stove, here is how.</w:t>
+      </w:r>
+      <w:r>
+        <w:t xml:space="preserve"> </w:t>
+      </w:r>
+      <w:r>
+        <w:t xml:space="preserve">6.</w:t>
+      </w:r>
+      <w:r>
+        <w:t xml:space="preserve"> </w:t>
+      </w:r>
+      <w:r>
+        <w:rPr>
+          <w:b/>
+          <w:bCs/>
+        </w:rPr>
+        <w:t xml:space="preserve">A CO alarm under 30,000₮</w:t>
+      </w:r>
+      <w:r>
+        <w:t xml:space="preserve"> </w:t>
+      </w:r>
+      <w:r>
+        <w:t xml:space="preserve">— Design a carbon monoxide detector a family can build or buy for a fraction of the 100,000-tugrik shop price.</w:t>
+      </w:r>
+      <w:r>
+        <w:t xml:space="preserve"> </w:t>
+      </w:r>
+      <w:r>
+        <w:t xml:space="preserve">7.</w:t>
+      </w:r>
+      <w:r>
+        <w:t xml:space="preserve"> </w:t>
+      </w:r>
+      <w:r>
+        <w:rPr>
+          <w:b/>
+          <w:bCs/>
+        </w:rPr>
+        <w:t xml:space="preserve">Headache or poisoning?</w:t>
+      </w:r>
+      <w:r>
+        <w:t xml:space="preserve"> </w:t>
+      </w:r>
+      <w:r>
+        <w:t xml:space="preserve">— In under a minute, someone with a headache and nausea in a heated home knows whether it could be carbon monoxide and is on the phone to 103.</w:t>
+      </w:r>
+      <w:r>
+        <w:t xml:space="preserve"> </w:t>
+      </w:r>
+      <w:r>
+        <w:t xml:space="preserve">8.</w:t>
+      </w:r>
+      <w:r>
+        <w:t xml:space="preserve"> </w:t>
+      </w:r>
+      <w:r>
+        <w:rPr>
+          <w:b/>
+          <w:bCs/>
+        </w:rPr>
+        <w:t xml:space="preserve">Where should the ambulances wait?</w:t>
+      </w:r>
+      <w:r>
+        <w:t xml:space="preserve"> </w:t>
+      </w:r>
+      <w:r>
+        <w:t xml:space="preserve">— Emergency services know which khoroos will see the most poisonings tonight and place crews there before the calls come.</w:t>
       </w:r>
     </w:p>
     <w:p>
@@ -923,25 +1027,89 @@
         <w:t xml:space="preserve"> </w:t>
       </w:r>
       <w:r>
-        <w:t xml:space="preserve">9. Help a household find out whether its well water is safe this month, and what to do if not.</w:t>
-      </w:r>
-      <w:r>
-        <w:t xml:space="preserve"> </w:t>
-      </w:r>
-      <w:r>
-        <w:t xml:space="preserve">10. Help a khoroo track which latrines were upgraded and which leak.</w:t>
-      </w:r>
-      <w:r>
-        <w:t xml:space="preserve"> </w:t>
-      </w:r>
-      <w:r>
-        <w:t xml:space="preserve">11. Help a kindergarten know whether the soil in its yard is safe for children to play on.</w:t>
-      </w:r>
-      <w:r>
-        <w:t xml:space="preserve"> </w:t>
-      </w:r>
-      <w:r>
-        <w:t xml:space="preserve">12. Help a family with a child under five cut diarrhoeal disease risk with what it already has.</w:t>
+        <w:t xml:space="preserve">9.</w:t>
+      </w:r>
+      <w:r>
+        <w:t xml:space="preserve"> </w:t>
+      </w:r>
+      <w:r>
+        <w:rPr>
+          <w:b/>
+          <w:bCs/>
+        </w:rPr>
+        <w:t xml:space="preserve">Is my well OK this month?</w:t>
+      </w:r>
+      <w:r>
+        <w:t xml:space="preserve"> </w:t>
+      </w:r>
+      <w:r>
+        <w:t xml:space="preserve">— A household that drinks from a well gets a test result it can read, and one clear next step if the answer is no.</w:t>
+      </w:r>
+      <w:r>
+        <w:t xml:space="preserve"> </w:t>
+      </w:r>
+      <w:r>
+        <w:t xml:space="preserve">10.</w:t>
+      </w:r>
+      <w:r>
+        <w:t xml:space="preserve"> </w:t>
+      </w:r>
+      <w:r>
+        <w:rPr>
+          <w:b/>
+          <w:bCs/>
+        </w:rPr>
+        <w:t xml:space="preserve">The latrine map</w:t>
+      </w:r>
+      <w:r>
+        <w:t xml:space="preserve"> </w:t>
+      </w:r>
+      <w:r>
+        <w:t xml:space="preserve">— A khoroo office knows which pit latrines were upgraded, which leak and which are next, without a paper binder.</w:t>
+      </w:r>
+      <w:r>
+        <w:t xml:space="preserve"> </w:t>
+      </w:r>
+      <w:r>
+        <w:t xml:space="preserve">11.</w:t>
+      </w:r>
+      <w:r>
+        <w:t xml:space="preserve"> </w:t>
+      </w:r>
+      <w:r>
+        <w:rPr>
+          <w:b/>
+          <w:bCs/>
+        </w:rPr>
+        <w:t xml:space="preserve">Can the kids play here?</w:t>
+      </w:r>
+      <w:r>
+        <w:t xml:space="preserve"> </w:t>
+      </w:r>
+      <w:r>
+        <w:t xml:space="preserve">— A kindergarten director finds out whether the soil in the yard is safe, and what to do if it isn't.</w:t>
+      </w:r>
+      <w:r>
+        <w:t xml:space="preserve"> </w:t>
+      </w:r>
+      <w:r>
+        <w:t xml:space="preserve">12.</w:t>
+      </w:r>
+      <w:r>
+        <w:t xml:space="preserve"> </w:t>
+      </w:r>
+      <w:r>
+        <w:rPr>
+          <w:b/>
+          <w:bCs/>
+        </w:rPr>
+        <w:t xml:space="preserve">Clean hands, zero budget</w:t>
+      </w:r>
+      <w:r>
+        <w:t xml:space="preserve"> </w:t>
+      </w:r>
+      <w:r>
+        <w:t xml:space="preserve">— A family with a child under five cuts the risk of diarrhoea using only what is already in the home.</w:t>
       </w:r>
     </w:p>
     <w:p>
@@ -959,25 +1127,89 @@
         <w:t xml:space="preserve"> </w:t>
       </w:r>
       <w:r>
-        <w:t xml:space="preserve">13. Help a ger-area household get waste collected on a predictable day.</w:t>
-      </w:r>
-      <w:r>
-        <w:t xml:space="preserve"> </w:t>
-      </w:r>
-      <w:r>
-        <w:t xml:space="preserve">14. Help a shop or school sort and sell its recyclables without a deposit scheme.</w:t>
-      </w:r>
-      <w:r>
-        <w:t xml:space="preserve"> </w:t>
-      </w:r>
-      <w:r>
-        <w:t xml:space="preserve">15. Help a household get rid of batteries, medicine and chemicals safely.</w:t>
-      </w:r>
-      <w:r>
-        <w:t xml:space="preserve"> </w:t>
-      </w:r>
-      <w:r>
-        <w:t xml:space="preserve">16. Help a waste picker work safer and earn more.</w:t>
+        <w:t xml:space="preserve">13.</w:t>
+      </w:r>
+      <w:r>
+        <w:t xml:space="preserve"> </w:t>
+      </w:r>
+      <w:r>
+        <w:rPr>
+          <w:b/>
+          <w:bCs/>
+        </w:rPr>
+        <w:t xml:space="preserve">Garbage day you can trust</w:t>
+      </w:r>
+      <w:r>
+        <w:t xml:space="preserve"> </w:t>
+      </w:r>
+      <w:r>
+        <w:t xml:space="preserve">— A ger-area household knows the day and hour the truck comes, and gets told when it won't.</w:t>
+      </w:r>
+      <w:r>
+        <w:t xml:space="preserve"> </w:t>
+      </w:r>
+      <w:r>
+        <w:t xml:space="preserve">14.</w:t>
+      </w:r>
+      <w:r>
+        <w:t xml:space="preserve"> </w:t>
+      </w:r>
+      <w:r>
+        <w:rPr>
+          <w:b/>
+          <w:bCs/>
+        </w:rPr>
+        <w:t xml:space="preserve">Sell the bottles</w:t>
+      </w:r>
+      <w:r>
+        <w:t xml:space="preserve"> </w:t>
+      </w:r>
+      <w:r>
+        <w:t xml:space="preserve">— A school or corner shop sorts its plastic and cardboard and finds a buyer, no deposit scheme needed.</w:t>
+      </w:r>
+      <w:r>
+        <w:t xml:space="preserve"> </w:t>
+      </w:r>
+      <w:r>
+        <w:t xml:space="preserve">15.</w:t>
+      </w:r>
+      <w:r>
+        <w:t xml:space="preserve"> </w:t>
+      </w:r>
+      <w:r>
+        <w:rPr>
+          <w:b/>
+          <w:bCs/>
+        </w:rPr>
+        <w:t xml:space="preserve">Where do dead batteries go?</w:t>
+      </w:r>
+      <w:r>
+        <w:t xml:space="preserve"> </w:t>
+      </w:r>
+      <w:r>
+        <w:t xml:space="preserve">— A household gets rid of batteries, old medicine and chemicals safely instead of throwing them in the bin.</w:t>
+      </w:r>
+      <w:r>
+        <w:t xml:space="preserve"> </w:t>
+      </w:r>
+      <w:r>
+        <w:t xml:space="preserve">16.</w:t>
+      </w:r>
+      <w:r>
+        <w:t xml:space="preserve"> </w:t>
+      </w:r>
+      <w:r>
+        <w:rPr>
+          <w:b/>
+          <w:bCs/>
+        </w:rPr>
+        <w:t xml:space="preserve">Safer picking, better pay</w:t>
+      </w:r>
+      <w:r>
+        <w:t xml:space="preserve"> </w:t>
+      </w:r>
+      <w:r>
+        <w:t xml:space="preserve">— A waste picker at the landfill works with fewer injuries and earns more for what they collect.</w:t>
       </w:r>
     </w:p>
     <w:p>
@@ -995,25 +1227,89 @@
         <w:t xml:space="preserve"> </w:t>
       </w:r>
       <w:r>
-        <w:t xml:space="preserve">17. Warn a herder family in a specific soum of a dzud-grade cold wave three days ahead, with what to do.</w:t>
-      </w:r>
-      <w:r>
-        <w:t xml:space="preserve"> </w:t>
-      </w:r>
-      <w:r>
-        <w:t xml:space="preserve">18. Give a herder who lost livestock a way to talk to someone, over a basic phone.</w:t>
-      </w:r>
-      <w:r>
-        <w:t xml:space="preserve"> </w:t>
-      </w:r>
-      <w:r>
-        <w:t xml:space="preserve">19. Help a soum doctor triage a sick child remotely when roads are closed.</w:t>
-      </w:r>
-      <w:r>
-        <w:t xml:space="preserve"> </w:t>
-      </w:r>
-      <w:r>
-        <w:t xml:space="preserve">20. Help an elderly city resident through a heat wave.</w:t>
+        <w:t xml:space="preserve">17.</w:t>
+      </w:r>
+      <w:r>
+        <w:t xml:space="preserve"> </w:t>
+      </w:r>
+      <w:r>
+        <w:rPr>
+          <w:b/>
+          <w:bCs/>
+        </w:rPr>
+        <w:t xml:space="preserve">Three days' warning</w:t>
+      </w:r>
+      <w:r>
+        <w:t xml:space="preserve"> </w:t>
+      </w:r>
+      <w:r>
+        <w:t xml:space="preserve">— A herder family in one named soum hears about a dzud-grade cold wave three days early, with a checklist for the herd.</w:t>
+      </w:r>
+      <w:r>
+        <w:t xml:space="preserve"> </w:t>
+      </w:r>
+      <w:r>
+        <w:t xml:space="preserve">18.</w:t>
+      </w:r>
+      <w:r>
+        <w:t xml:space="preserve"> </w:t>
+      </w:r>
+      <w:r>
+        <w:rPr>
+          <w:b/>
+          <w:bCs/>
+        </w:rPr>
+        <w:t xml:space="preserve">Someone to talk to</w:t>
+      </w:r>
+      <w:r>
+        <w:t xml:space="preserve"> </w:t>
+      </w:r>
+      <w:r>
+        <w:t xml:space="preserve">— A herder who has just lost livestock reaches a real person from a basic phone, no smartphone or data needed.</w:t>
+      </w:r>
+      <w:r>
+        <w:t xml:space="preserve"> </w:t>
+      </w:r>
+      <w:r>
+        <w:t xml:space="preserve">19.</w:t>
+      </w:r>
+      <w:r>
+        <w:t xml:space="preserve"> </w:t>
+      </w:r>
+      <w:r>
+        <w:rPr>
+          <w:b/>
+          <w:bCs/>
+        </w:rPr>
+        <w:t xml:space="preserve">Snowed-in triage</w:t>
+      </w:r>
+      <w:r>
+        <w:t xml:space="preserve"> </w:t>
+      </w:r>
+      <w:r>
+        <w:t xml:space="preserve">— A soum doctor decides whether a sick child needs evacuation when the road to the aimag centre is closed.</w:t>
+      </w:r>
+      <w:r>
+        <w:t xml:space="preserve"> </w:t>
+      </w:r>
+      <w:r>
+        <w:t xml:space="preserve">20.</w:t>
+      </w:r>
+      <w:r>
+        <w:t xml:space="preserve"> </w:t>
+      </w:r>
+      <w:r>
+        <w:rPr>
+          <w:b/>
+          <w:bCs/>
+        </w:rPr>
+        <w:t xml:space="preserve">Heat-wave buddy</w:t>
+      </w:r>
+      <w:r>
+        <w:t xml:space="preserve"> </w:t>
+      </w:r>
+      <w:r>
+        <w:t xml:space="preserve">— An older person living alone in a city apartment gets through a heat wave, with someone checking in.</w:t>
       </w:r>
     </w:p>
     <w:p>
@@ -1031,25 +1327,89 @@
         <w:t xml:space="preserve"> </w:t>
       </w:r>
       <w:r>
-        <w:t xml:space="preserve">21. Forecast next week's pediatric admissions at one Ulaanbaatar hospital from air and weather data.</w:t>
-      </w:r>
-      <w:r>
-        <w:t xml:space="preserve"> </w:t>
-      </w:r>
-      <w:r>
-        <w:t xml:space="preserve">22. Build the city's first public environmental-health index that a journalist can quote daily.</w:t>
-      </w:r>
-      <w:r>
-        <w:t xml:space="preserve"> </w:t>
-      </w:r>
-      <w:r>
-        <w:t xml:space="preserve">23. Register and quality-check citizen air sensors so their data can be trusted.</w:t>
-      </w:r>
-      <w:r>
-        <w:t xml:space="preserve"> </w:t>
-      </w:r>
-      <w:r>
-        <w:t xml:space="preserve">24. Publish one clean, documented dataset joining air, weather and health that the next hackathon can use.</w:t>
+        <w:t xml:space="preserve">21.</w:t>
+      </w:r>
+      <w:r>
+        <w:t xml:space="preserve"> </w:t>
+      </w:r>
+      <w:r>
+        <w:rPr>
+          <w:b/>
+          <w:bCs/>
+        </w:rPr>
+        <w:t xml:space="preserve">A weather forecast for the hospital</w:t>
+      </w:r>
+      <w:r>
+        <w:t xml:space="preserve"> </w:t>
+      </w:r>
+      <w:r>
+        <w:t xml:space="preserve">— Predict next week's children's admissions at one Ulaanbaatar hospital from air and weather data, and beat a naive guess.</w:t>
+      </w:r>
+      <w:r>
+        <w:t xml:space="preserve"> </w:t>
+      </w:r>
+      <w:r>
+        <w:t xml:space="preserve">22.</w:t>
+      </w:r>
+      <w:r>
+        <w:t xml:space="preserve"> </w:t>
+      </w:r>
+      <w:r>
+        <w:rPr>
+          <w:b/>
+          <w:bCs/>
+        </w:rPr>
+        <w:t xml:space="preserve">The morning health-air score</w:t>
+      </w:r>
+      <w:r>
+        <w:t xml:space="preserve"> </w:t>
+      </w:r>
+      <w:r>
+        <w:t xml:space="preserve">— Build a one-number environmental-health index a journalist can quote every morning.</w:t>
+      </w:r>
+      <w:r>
+        <w:t xml:space="preserve"> </w:t>
+      </w:r>
+      <w:r>
+        <w:t xml:space="preserve">23.</w:t>
+      </w:r>
+      <w:r>
+        <w:t xml:space="preserve"> </w:t>
+      </w:r>
+      <w:r>
+        <w:rPr>
+          <w:b/>
+          <w:bCs/>
+        </w:rPr>
+        <w:t xml:space="preserve">Can we trust this sensor?</w:t>
+      </w:r>
+      <w:r>
+        <w:t xml:space="preserve"> </w:t>
+      </w:r>
+      <w:r>
+        <w:t xml:space="preserve">— Register citizen air sensors and automatically flag the broken or badly placed ones.</w:t>
+      </w:r>
+      <w:r>
+        <w:t xml:space="preserve"> </w:t>
+      </w:r>
+      <w:r>
+        <w:t xml:space="preserve">24.</w:t>
+      </w:r>
+      <w:r>
+        <w:t xml:space="preserve"> </w:t>
+      </w:r>
+      <w:r>
+        <w:rPr>
+          <w:b/>
+          <w:bCs/>
+        </w:rPr>
+        <w:t xml:space="preserve">Leave a dataset behind</w:t>
+      </w:r>
+      <w:r>
+        <w:t xml:space="preserve"> </w:t>
+      </w:r>
+      <w:r>
+        <w:t xml:space="preserve">— Publish one clean, documented dataset joining air, weather and health that the next hackathon can start from.</w:t>
       </w:r>
     </w:p>
     <w:p>

</xml_diff>

<commit_message>
Problem bank: open-ended statements
</commit_message>
<xml_diff>
--- a/docs/02-theme-tracks-judging-agenda.docx
+++ b/docs/02-theme-tracks-judging-agenda.docx
@@ -809,7 +809,7 @@
         <w:pStyle w:val="FirstParagraph"/>
       </w:pPr>
       <w:r>
-        <w:t xml:space="preserve">Twenty-four statements, four per track. Each names a user and a verb. Teams claim one; three claims close a statement.</w:t>
+        <w:t xml:space="preserve">Twenty-four statements, four per track. Each states a problem and who has it, never the solution, so two teams on the same statement can build very different things. Teams claim one; three claims close a statement.</w:t>
       </w:r>
     </w:p>
     <w:p>
@@ -843,7 +843,7 @@
         <w:t xml:space="preserve"> </w:t>
       </w:r>
       <w:r>
-        <w:t xml:space="preserve">— At 7:30 a.m. a parent in a ger district checks one screen and knows whether their eight-year-old walks to school today, rides, or stays in.</w:t>
+        <w:t xml:space="preserve">— On smoggy mornings, parents guess whether it is safe for their kids to be outside. Help them stop guessing.</w:t>
       </w:r>
     </w:p>
     <w:p>
@@ -859,13 +859,13 @@
           <w:b/>
           <w:bCs/>
         </w:rPr>
-        <w:t xml:space="preserve">Recess indoors, receipts included</w:t>
-      </w:r>
-      <w:r>
-        <w:t xml:space="preserve"> </w:t>
-      </w:r>
-      <w:r>
-        <w:t xml:space="preserve">— A school principal decides when breaks move indoors and can show parents the air numbers behind the call.</w:t>
+        <w:t xml:space="preserve">Recess indoors?</w:t>
+      </w:r>
+      <w:r>
+        <w:t xml:space="preserve"> </w:t>
+      </w:r>
+      <w:r>
+        <w:t xml:space="preserve">— Schools decide on outdoor breaks and PE with little to go on, and parents question every call. Help schools make the call.</w:t>
       </w:r>
     </w:p>
     <w:p>
@@ -887,7 +887,7 @@
         <w:t xml:space="preserve"> </w:t>
       </w:r>
       <w:r>
-        <w:t xml:space="preserve">— A family with one stove, one room and a tight budget finds the mask or purifier that actually helps, and what it costs per winter.</w:t>
+        <w:t xml:space="preserve">— Families on a tight budget can't tell which masks, purifiers or habits actually protect them. Help them spend wisely.</w:t>
       </w:r>
     </w:p>
     <w:p>
@@ -909,7 +909,7 @@
         <w:t xml:space="preserve"> </w:t>
       </w:r>
       <w:r>
-        <w:t xml:space="preserve">— A clinic sees how many children will come in with breathing problems tomorrow, from today's air.</w:t>
+        <w:t xml:space="preserve">— Clinics get hit by waves of children with breathing problems on bad-air days. Help them see the wave coming.</w:t>
       </w:r>
     </w:p>
     <w:p>
@@ -937,13 +937,13 @@
           <w:b/>
           <w:bCs/>
         </w:rPr>
-        <w:t xml:space="preserve">The coldest-night alarm</w:t>
-      </w:r>
-      <w:r>
-        <w:t xml:space="preserve"> </w:t>
-      </w:r>
-      <w:r>
-        <w:t xml:space="preserve">— Two days before the coldest night of the week, a briquette-heated household gets a message: ventilate, check the stove, here is how.</w:t>
+        <w:t xml:space="preserve">The coldest-night problem</w:t>
+      </w:r>
+      <w:r>
+        <w:t xml:space="preserve"> </w:t>
+      </w:r>
+      <w:r>
+        <w:t xml:space="preserve">— Carbon monoxide poisoning peaks on the coldest nights, in homes that heat with briquettes. Help those homes get through the night.</w:t>
       </w:r>
       <w:r>
         <w:t xml:space="preserve"> </w:t>
@@ -959,13 +959,13 @@
           <w:b/>
           <w:bCs/>
         </w:rPr>
-        <w:t xml:space="preserve">A CO alarm under 30,000₮</w:t>
-      </w:r>
-      <w:r>
-        <w:t xml:space="preserve"> </w:t>
-      </w:r>
-      <w:r>
-        <w:t xml:space="preserve">— Design a carbon monoxide detector a family can build or buy for a fraction of the 100,000-tugrik shop price.</w:t>
+        <w:t xml:space="preserve">A CO alarm people can afford</w:t>
+      </w:r>
+      <w:r>
+        <w:t xml:space="preserve"> </w:t>
+      </w:r>
+      <w:r>
+        <w:t xml:space="preserve">— Most homes that need a carbon monoxide alarm don't have one, because the shop price is around 100,000 tugrik. Change that.</w:t>
       </w:r>
       <w:r>
         <w:t xml:space="preserve"> </w:t>
@@ -987,7 +987,7 @@
         <w:t xml:space="preserve"> </w:t>
       </w:r>
       <w:r>
-        <w:t xml:space="preserve">— In under a minute, someone with a headache and nausea in a heated home knows whether it could be carbon monoxide and is on the phone to 103.</w:t>
+        <w:t xml:space="preserve">— Early carbon monoxide poisoning feels like a headache, so people wait too long. Help them recognise it and get help fast.</w:t>
       </w:r>
       <w:r>
         <w:t xml:space="preserve"> </w:t>
@@ -1003,13 +1003,13 @@
           <w:b/>
           <w:bCs/>
         </w:rPr>
-        <w:t xml:space="preserve">Where should the ambulances wait?</w:t>
-      </w:r>
-      <w:r>
-        <w:t xml:space="preserve"> </w:t>
-      </w:r>
-      <w:r>
-        <w:t xml:space="preserve">— Emergency services know which khoroos will see the most poisonings tonight and place crews there before the calls come.</w:t>
+        <w:t xml:space="preserve">Where should the ambulances be?</w:t>
+      </w:r>
+      <w:r>
+        <w:t xml:space="preserve"> </w:t>
+      </w:r>
+      <w:r>
+        <w:t xml:space="preserve">— Emergency services respond to poisonings after the call. Help them get ahead of the busiest nights.</w:t>
       </w:r>
     </w:p>
     <w:p>
@@ -1037,13 +1037,13 @@
           <w:b/>
           <w:bCs/>
         </w:rPr>
-        <w:t xml:space="preserve">Is my well OK this month?</w:t>
-      </w:r>
-      <w:r>
-        <w:t xml:space="preserve"> </w:t>
-      </w:r>
-      <w:r>
-        <w:t xml:space="preserve">— A household that drinks from a well gets a test result it can read, and one clear next step if the answer is no.</w:t>
+        <w:t xml:space="preserve">Is my well OK?</w:t>
+      </w:r>
+      <w:r>
+        <w:t xml:space="preserve"> </w:t>
+      </w:r>
+      <w:r>
+        <w:t xml:space="preserve">— Families who drink from wells rarely know if the water is safe. Help them find out, and know what to do next.</w:t>
       </w:r>
       <w:r>
         <w:t xml:space="preserve"> </w:t>
@@ -1059,13 +1059,13 @@
           <w:b/>
           <w:bCs/>
         </w:rPr>
-        <w:t xml:space="preserve">The latrine map</w:t>
-      </w:r>
-      <w:r>
-        <w:t xml:space="preserve"> </w:t>
-      </w:r>
-      <w:r>
-        <w:t xml:space="preserve">— A khoroo office knows which pit latrines were upgraded, which leak and which are next, without a paper binder.</w:t>
+        <w:t xml:space="preserve">The latrine problem</w:t>
+      </w:r>
+      <w:r>
+        <w:t xml:space="preserve"> </w:t>
+      </w:r>
+      <w:r>
+        <w:t xml:space="preserve">— Ulaanbaatar has around 145,000 pit latrines, and nobody has a clear picture of which ones leak. Help fix that.</w:t>
       </w:r>
       <w:r>
         <w:t xml:space="preserve"> </w:t>
@@ -1087,7 +1087,7 @@
         <w:t xml:space="preserve"> </w:t>
       </w:r>
       <w:r>
-        <w:t xml:space="preserve">— A kindergarten director finds out whether the soil in the yard is safe, and what to do if it isn't.</w:t>
+        <w:t xml:space="preserve">— Kindergartens and schools don't know if the ground their children play on is contaminated. Help them find out.</w:t>
       </w:r>
       <w:r>
         <w:t xml:space="preserve"> </w:t>
@@ -1109,7 +1109,7 @@
         <w:t xml:space="preserve"> </w:t>
       </w:r>
       <w:r>
-        <w:t xml:space="preserve">— A family with a child under five cuts the risk of diarrhoea using only what is already in the home.</w:t>
+        <w:t xml:space="preserve">— Diarrhoeal disease hits young children hardest in homes without running water. Help families protect them with what they have.</w:t>
       </w:r>
     </w:p>
     <w:p>
@@ -1143,7 +1143,7 @@
         <w:t xml:space="preserve"> </w:t>
       </w:r>
       <w:r>
-        <w:t xml:space="preserve">— A ger-area household knows the day and hour the truck comes, and gets told when it won't.</w:t>
+        <w:t xml:space="preserve">— In ger areas the garbage truck is unpredictable, so waste piles up or gets dumped. Help households and collectors line up.</w:t>
       </w:r>
       <w:r>
         <w:t xml:space="preserve"> </w:t>
@@ -1165,7 +1165,7 @@
         <w:t xml:space="preserve"> </w:t>
       </w:r>
       <w:r>
-        <w:t xml:space="preserve">— A school or corner shop sorts its plastic and cardboard and finds a buyer, no deposit scheme needed.</w:t>
+        <w:t xml:space="preserve">— Recyclables end up in the trash because sorting and selling them is a hassle. Make it worth it.</w:t>
       </w:r>
       <w:r>
         <w:t xml:space="preserve"> </w:t>
@@ -1187,7 +1187,7 @@
         <w:t xml:space="preserve"> </w:t>
       </w:r>
       <w:r>
-        <w:t xml:space="preserve">— A household gets rid of batteries, old medicine and chemicals safely instead of throwing them in the bin.</w:t>
+        <w:t xml:space="preserve">— Batteries, old medicine and chemicals go in the household bin. Help them go somewhere safe.</w:t>
       </w:r>
       <w:r>
         <w:t xml:space="preserve"> </w:t>
@@ -1209,7 +1209,7 @@
         <w:t xml:space="preserve"> </w:t>
       </w:r>
       <w:r>
-        <w:t xml:space="preserve">— A waste picker at the landfill works with fewer injuries and earns more for what they collect.</w:t>
+        <w:t xml:space="preserve">— Informal waste pickers do dangerous work for little money. Make their work safer or better paid.</w:t>
       </w:r>
     </w:p>
     <w:p>
@@ -1237,13 +1237,13 @@
           <w:b/>
           <w:bCs/>
         </w:rPr>
-        <w:t xml:space="preserve">Three days' warning</w:t>
-      </w:r>
-      <w:r>
-        <w:t xml:space="preserve"> </w:t>
-      </w:r>
-      <w:r>
-        <w:t xml:space="preserve">— A herder family in one named soum hears about a dzud-grade cold wave three days early, with a checklist for the herd.</w:t>
+        <w:t xml:space="preserve">Before the dzud hits</w:t>
+      </w:r>
+      <w:r>
+        <w:t xml:space="preserve"> </w:t>
+      </w:r>
+      <w:r>
+        <w:t xml:space="preserve">— Herders often learn about a deadly cold spell too late to protect the herd. Help them prepare in time.</w:t>
       </w:r>
       <w:r>
         <w:t xml:space="preserve"> </w:t>
@@ -1265,7 +1265,7 @@
         <w:t xml:space="preserve"> </w:t>
       </w:r>
       <w:r>
-        <w:t xml:space="preserve">— A herder who has just lost livestock reaches a real person from a basic phone, no smartphone or data needed.</w:t>
+        <w:t xml:space="preserve">— Losing livestock to a dzud is losing a livelihood, and help is far away. Support herders' mental health, even on a basic phone.</w:t>
       </w:r>
       <w:r>
         <w:t xml:space="preserve"> </w:t>
@@ -1281,13 +1281,13 @@
           <w:b/>
           <w:bCs/>
         </w:rPr>
-        <w:t xml:space="preserve">Snowed-in triage</w:t>
-      </w:r>
-      <w:r>
-        <w:t xml:space="preserve"> </w:t>
-      </w:r>
-      <w:r>
-        <w:t xml:space="preserve">— A soum doctor decides whether a sick child needs evacuation when the road to the aimag centre is closed.</w:t>
+        <w:t xml:space="preserve">Snowed-in</w:t>
+      </w:r>
+      <w:r>
+        <w:t xml:space="preserve"> </w:t>
+      </w:r>
+      <w:r>
+        <w:t xml:space="preserve">— When roads close, remote soums are cut off from hospitals. Help local doctors and families cope with medical emergencies.</w:t>
       </w:r>
       <w:r>
         <w:t xml:space="preserve"> </w:t>
@@ -1303,13 +1303,13 @@
           <w:b/>
           <w:bCs/>
         </w:rPr>
-        <w:t xml:space="preserve">Heat-wave buddy</w:t>
-      </w:r>
-      <w:r>
-        <w:t xml:space="preserve"> </w:t>
-      </w:r>
-      <w:r>
-        <w:t xml:space="preserve">— An older person living alone in a city apartment gets through a heat wave, with someone checking in.</w:t>
+        <w:t xml:space="preserve">Heat-wave check</w:t>
+      </w:r>
+      <w:r>
+        <w:t xml:space="preserve"> </w:t>
+      </w:r>
+      <w:r>
+        <w:t xml:space="preserve">— Summer heat waves are getting worse, and older people living alone are most at risk. Help keep them safe.</w:t>
       </w:r>
     </w:p>
     <w:p>
@@ -1337,13 +1337,13 @@
           <w:b/>
           <w:bCs/>
         </w:rPr>
-        <w:t xml:space="preserve">A weather forecast for the hospital</w:t>
-      </w:r>
-      <w:r>
-        <w:t xml:space="preserve"> </w:t>
-      </w:r>
-      <w:r>
-        <w:t xml:space="preserve">— Predict next week's children's admissions at one Ulaanbaatar hospital from air and weather data, and beat a naive guess.</w:t>
+        <w:t xml:space="preserve">Forecast the hospital</w:t>
+      </w:r>
+      <w:r>
+        <w:t xml:space="preserve"> </w:t>
+      </w:r>
+      <w:r>
+        <w:t xml:space="preserve">— Hospitals can't see a rush of patients coming even when the air and weather data could warn them. Build that warning.</w:t>
       </w:r>
       <w:r>
         <w:t xml:space="preserve"> </w:t>
@@ -1359,13 +1359,13 @@
           <w:b/>
           <w:bCs/>
         </w:rPr>
-        <w:t xml:space="preserve">The morning health-air score</w:t>
-      </w:r>
-      <w:r>
-        <w:t xml:space="preserve"> </w:t>
-      </w:r>
-      <w:r>
-        <w:t xml:space="preserve">— Build a one-number environmental-health index a journalist can quote every morning.</w:t>
+        <w:t xml:space="preserve">One number for the news</w:t>
+      </w:r>
+      <w:r>
+        <w:t xml:space="preserve"> </w:t>
+      </w:r>
+      <w:r>
+        <w:t xml:space="preserve">— People hear about air, weather and illness separately. Give the public one clear picture of environmental health.</w:t>
       </w:r>
       <w:r>
         <w:t xml:space="preserve"> </w:t>
@@ -1387,7 +1387,7 @@
         <w:t xml:space="preserve"> </w:t>
       </w:r>
       <w:r>
-        <w:t xml:space="preserve">— Register citizen air sensors and automatically flag the broken or badly placed ones.</w:t>
+        <w:t xml:space="preserve">— Cheap air sensors are everywhere, and some of them are wrong. Help tell good data from bad.</w:t>
       </w:r>
       <w:r>
         <w:t xml:space="preserve"> </w:t>
@@ -1409,7 +1409,7 @@
         <w:t xml:space="preserve"> </w:t>
       </w:r>
       <w:r>
-        <w:t xml:space="preserve">— Publish one clean, documented dataset joining air, weather and health that the next hackathon can start from.</w:t>
+        <w:t xml:space="preserve">— Air, weather and health data sit in different places and formats. Join them so the next team can build on them.</w:t>
       </w:r>
     </w:p>
     <w:p>

</xml_diff>

<commit_message>
GDG Ulaanbaatar as community partner; fix key dates in README
</commit_message>
<xml_diff>
--- a/docs/02-theme-tracks-judging-agenda.docx
+++ b/docs/02-theme-tracks-judging-agenda.docx
@@ -2958,7 +2958,7 @@
         <w:t xml:space="preserve"> </w:t>
       </w:r>
       <w:r>
-        <w:t xml:space="preserve">University students and engineers, at least two per track, three willing to stay past midnight. Ask by October 16, confirm by November 20.</w:t>
+        <w:t xml:space="preserve">University students and engineers, at least two per track, three willing to stay past midnight. GDG Ulaanbaatar (Google Developer Group), our community partner, provides 8–10 of them; we find the rest. Ask by October 16, confirm by November 20.</w:t>
       </w:r>
     </w:p>
     <w:p>
@@ -2976,7 +2976,7 @@
         <w:t xml:space="preserve"> </w:t>
       </w:r>
       <w:r>
-        <w:t xml:space="preserve">Three per track (five tracks): one engineer or data scientist, one health or environment professional (Uram Care's network, MNUMS, hospitals, the air pollution agency, environmental NGOs), one sponsor representative. Ask by October 16, confirm by November 20, brief on November 27 and again at 11:00 on the day.</w:t>
+        <w:t xml:space="preserve">Three per track (five tracks), five of them from GDG Ulaanbaatar: one engineer or data scientist, one health or environment professional (Uram Care's network, MNUMS, hospitals, the air pollution agency, environmental NGOs), one sponsor representative. Ask by October 16, confirm by November 20, brief on November 27 and again at 11:00 on the day.</w:t>
       </w:r>
     </w:p>
     <w:p>

</xml_diff>